<commit_message>
docs: add cross-actor BPMN swimlane flow to section 2.1 in PRD.docx and markdown
</commit_message>
<xml_diff>
--- a/PRD.docx
+++ b/PRD.docx
@@ -1798,12 +1798,12 @@
           <w:color w:val="1F2937"/>
           <w:sz w:val="25"/>
         </w:rPr>
-        <w:t>2.1 Mô hình hóa nghiệp vụ</w:t>
+        <w:t>2.1 Mô hình hóa nghiệp vụ (Luồng liên thông đa tác nhân – RECONCILE USER SCHOOL)</w:t>
       </w:r>
     </w:p>
     <w:p>
       <w:r>
-        <w:t>Quy trình thanh quyết toán và đối soát vận hành theo mô hình khép kín giữa 4 trụ cột nghiệp vụ:</w:t>
+        <w:t>Phân hệ Đối soát (Module M6) đóng vai trò là mắt xích tài chính cốt lõi trong toàn bộ vòng đời hợp tác dịch vụ giữa FINVIET và Đối tác Nhà trường. Toàn bộ quy trình đối soát và quyết toán người dùng/học sinh (RECONCILE USER SCHOOL) được mô hình hóa theo chuẩn BPMN Swimlane với sự tham gia phối hợp xuyên suốt của 3 tác nhân (Làn bơi – Swimlanes):</w:t>
       </w:r>
     </w:p>
     <w:p>
@@ -1812,7 +1812,7 @@
         <w:spacing w:before="20" w:after="40"/>
       </w:pPr>
       <w:r>
-        <w:t>1. Quản trị cấu hình (SM1): Chuyên viên Vận hành khai báo nhóm trường, thiết lập đơn vị đối soát (GROUP vs BRANCH), chu kỳ (Năm vs Kỳ), ma trận biểu phí chi nhánh (đ/HS/năm hoặc đ/HS/tháng), ngưỡng thu và cấp phát mật khẩu mở file đối soát.</w:t>
+        <w:t>1. Làn Vận hành FV (Finviet Operations / Ops Admin): Chịu trách nhiệm ký kết hợp đồng dịch vụ, khởi tạo hồ sơ pháp nhân nhóm trường và các chi nhánh cơ sở ban đầu.</w:t>
       </w:r>
     </w:p>
     <w:p>
@@ -1821,7 +1821,7 @@
         <w:spacing w:before="20" w:after="40"/>
       </w:pPr>
       <w:r>
-        <w:t>2. Động cơ tính phí &amp; Chốt chặn 0đ (Engine): Quét dữ liệu học sinh hoạt động đến Ngày chốt (Cut-off Date), chuẩn hóa 1 tháng = 30 ngày, áp dụng ngưỡng tính phí tối thiểu (BR06) và quy tắc làm tròn ngày dư (BR07). Chặn tạo phiên nếu có chi nhánh tổng phí = 0đ (MSG-01).</w:t>
+        <w:t>2. Làn Trường học (School Partner / Đối tác Nhà trường): Chịu trách nhiệm tạo Master Data học sinh, giáo viên, lớp học; triển khai đưa dịch vụ vào sử dụng; liên tục cập nhật biến động trạng thái học sinh (Active / Inactive) qua cổng phân nhánh song song (+); đối chiếu bảng kê và thực hiện thanh toán chi phí dịch vụ.</w:t>
       </w:r>
     </w:p>
     <w:p>
@@ -1830,18 +1830,2045 @@
         <w:spacing w:before="20" w:after="40"/>
       </w:pPr>
       <w:r>
-        <w:t>3. Phiên đối soát &amp; Vòng đời (SM2): Đóng băng cấu hình vào JSON Snapshot bất biến (ADR-M6-001). Thực thi State Machine 6 trạng thái từ Nháp → Chờ duyệt → Đã duyệt → Đã gửi trường → Đã thanh toán. Phiên đã thanh toán mở quyền tạo phiên truy thu con.</w:t>
+        <w:t>3. Làn ECO Card (Hệ thống ECO Card Portal &amp; Kế toán Finviet): Tự động đồng bộ Master Data; cấu hình danh mục dịch vụ và ma trận biểu phí; định kỳ tạo phiên đối soát (SM2) kèm bộ chốt an toàn 0 VNĐ (MSG-01); đóng băng Snapshot bất biến (ADR-M6-001); gửi mail biên bản kèm mật khẩu bảo mật; ghi nhận thanh toán và hoàn tất phiên đối soát.</w:t>
       </w:r>
     </w:p>
     <w:p>
       <w:pPr>
-        <w:pStyle w:val="ListBullet"/>
-        <w:spacing w:before="20" w:after="40"/>
+        <w:spacing w:before="160" w:after="80"/>
+        <w:jc w:val="center"/>
       </w:pPr>
       <w:r>
-        <w:t>4. Kiểm toán &amp; Giải trình (Audit Hub): Cho phép xem danh sách chi tiết học sinh, mở chế độ So sánh Log song song (Side-by-Side Audit), cảnh báo lệch ngày, cuộn mượt đồng bộ khi chọn học sinh và xuất file Excel 2 Sheet hoàn chỉnh.</w:t>
+        <w:drawing>
+          <wp:inline xmlns:a="http://schemas.openxmlformats.org/drawingml/2006/main" xmlns:pic="http://schemas.openxmlformats.org/drawingml/2006/picture">
+            <wp:extent cx="6217920" cy="1499830"/>
+            <wp:docPr id="1" name="Picture 1"/>
+            <wp:cNvGraphicFramePr>
+              <a:graphicFrameLocks noChangeAspect="1"/>
+            </wp:cNvGraphicFramePr>
+            <a:graphic>
+              <a:graphicData uri="http://schemas.openxmlformats.org/drawingml/2006/picture">
+                <pic:pic>
+                  <pic:nvPicPr>
+                    <pic:cNvPr id="0" name="flow_reconcile_user_school.png"/>
+                    <pic:cNvPicPr/>
+                  </pic:nvPicPr>
+                  <pic:blipFill>
+                    <a:blip r:embed="rId9"/>
+                    <a:stretch>
+                      <a:fillRect/>
+                    </a:stretch>
+                  </pic:blipFill>
+                  <pic:spPr>
+                    <a:xfrm>
+                      <a:off x="0" y="0"/>
+                      <a:ext cx="6217920" cy="1499830"/>
+                    </a:xfrm>
+                    <a:prstGeom prst="rect"/>
+                  </pic:spPr>
+                </pic:pic>
+              </a:graphicData>
+            </a:graphic>
+          </wp:inline>
+        </w:drawing>
       </w:r>
     </w:p>
+    <w:p>
+      <w:pPr>
+        <w:spacing w:before="40" w:after="160"/>
+        <w:jc w:val="center"/>
+      </w:pPr>
+      <w:r>
+        <w:rPr>
+          <w:i/>
+          <w:color w:val="6B7280"/>
+          <w:sz w:val="18"/>
+        </w:rPr>
+        <w:t>Sơ đồ luồng nghiệp vụ đối soát liên thông đa tác nhân (BPMN Swimlane: RECONCILE USER SCHOOL)</w:t>
+      </w:r>
+    </w:p>
+    <w:p>
+      <w:pPr>
+        <w:spacing w:before="120" w:after="60"/>
+      </w:pPr>
+      <w:r>
+        <w:rPr>
+          <w:b/>
+          <w:sz w:val="20"/>
+        </w:rPr>
+        <w:t>Bảng phân tích chi tiết 13 bước trong luồng RECONCILE USER SCHOOL:</w:t>
+      </w:r>
+    </w:p>
+    <w:tbl>
+      <w:tblPr>
+        <w:tblW w:type="auto" w:w="0"/>
+        <w:jc w:val="center"/>
+        <w:tblLook w:firstColumn="1" w:firstRow="1" w:lastColumn="0" w:lastRow="0" w:noHBand="0" w:noVBand="1" w:val="04A0"/>
+        <w:tblBorders>
+          <w:top w:val="single" w:sz="4" w:space="0" w:color="D1D5DB"/>
+          <w:bottom w:val="single" w:sz="4" w:space="0" w:color="D1D5DB"/>
+          <w:left w:val="single" w:sz="4" w:space="0" w:color="D1D5DB"/>
+          <w:right w:val="single" w:sz="4" w:space="0" w:color="D1D5DB"/>
+          <w:insideH w:val="single" w:sz="4" w:space="0" w:color="D1D5DB"/>
+          <w:insideV w:val="single" w:sz="4" w:space="0" w:color="D1D5DB"/>
+        </w:tblBorders>
+      </w:tblPr>
+      <w:tblGrid>
+        <w:gridCol w:w="1987"/>
+        <w:gridCol w:w="1987"/>
+        <w:gridCol w:w="1987"/>
+        <w:gridCol w:w="1987"/>
+        <w:gridCol w:w="1987"/>
+      </w:tblGrid>
+      <w:tr>
+        <w:tc>
+          <w:tcPr>
+            <w:tcW w:type="dxa" w:w="864"/>
+            <w:tcMar>
+              <w:top w:w="80" w:type="dxa"/>
+              <w:bottom w:w="80" w:type="dxa"/>
+              <w:left w:w="60" w:type="dxa"/>
+              <w:right w:w="60" w:type="dxa"/>
+            </w:tcMar>
+            <w:shd w:fill="F1F5F9"/>
+          </w:tcPr>
+          <w:p>
+            <w:pPr>
+              <w:spacing w:before="40" w:after="40" w:line="276" w:lineRule="auto"/>
+              <w:jc w:val="left"/>
+            </w:pPr>
+            <w:r/>
+            <w:r>
+              <w:rPr>
+                <w:rFonts w:ascii="Calibri" w:hAnsi="Calibri"/>
+                <w:b/>
+                <w:color w:val="1F2937"/>
+                <w:sz w:val="20"/>
+              </w:rPr>
+              <w:t>Bước</w:t>
+            </w:r>
+          </w:p>
+        </w:tc>
+        <w:tc>
+          <w:tcPr>
+            <w:tcW w:type="dxa" w:w="1872"/>
+            <w:tcMar>
+              <w:top w:w="80" w:type="dxa"/>
+              <w:bottom w:w="80" w:type="dxa"/>
+              <w:left w:w="60" w:type="dxa"/>
+              <w:right w:w="60" w:type="dxa"/>
+            </w:tcMar>
+            <w:shd w:fill="F1F5F9"/>
+          </w:tcPr>
+          <w:p>
+            <w:pPr>
+              <w:spacing w:before="40" w:after="40" w:line="276" w:lineRule="auto"/>
+              <w:jc w:val="left"/>
+            </w:pPr>
+            <w:r/>
+            <w:r>
+              <w:rPr>
+                <w:rFonts w:ascii="Calibri" w:hAnsi="Calibri"/>
+                <w:b/>
+                <w:color w:val="1F2937"/>
+                <w:sz w:val="20"/>
+              </w:rPr>
+              <w:t>Tác nhân (Swimlane)</w:t>
+            </w:r>
+          </w:p>
+        </w:tc>
+        <w:tc>
+          <w:tcPr>
+            <w:tcW w:type="dxa" w:w="2304"/>
+            <w:tcMar>
+              <w:top w:w="80" w:type="dxa"/>
+              <w:bottom w:w="80" w:type="dxa"/>
+              <w:left w:w="60" w:type="dxa"/>
+              <w:right w:w="60" w:type="dxa"/>
+            </w:tcMar>
+            <w:shd w:fill="F1F5F9"/>
+          </w:tcPr>
+          <w:p>
+            <w:pPr>
+              <w:spacing w:before="40" w:after="40" w:line="276" w:lineRule="auto"/>
+              <w:jc w:val="left"/>
+            </w:pPr>
+            <w:r/>
+            <w:r>
+              <w:rPr>
+                <w:rFonts w:ascii="Calibri" w:hAnsi="Calibri"/>
+                <w:b/>
+                <w:color w:val="1F2937"/>
+                <w:sz w:val="20"/>
+              </w:rPr>
+              <w:t>Hành động / Nghiệp vụ</w:t>
+            </w:r>
+          </w:p>
+        </w:tc>
+        <w:tc>
+          <w:tcPr>
+            <w:tcW w:type="dxa" w:w="3168"/>
+            <w:tcMar>
+              <w:top w:w="80" w:type="dxa"/>
+              <w:bottom w:w="80" w:type="dxa"/>
+              <w:left w:w="60" w:type="dxa"/>
+              <w:right w:w="60" w:type="dxa"/>
+            </w:tcMar>
+            <w:shd w:fill="F1F5F9"/>
+          </w:tcPr>
+          <w:p>
+            <w:pPr>
+              <w:spacing w:before="40" w:after="40" w:line="276" w:lineRule="auto"/>
+              <w:jc w:val="left"/>
+            </w:pPr>
+            <w:r/>
+            <w:r>
+              <w:rPr>
+                <w:rFonts w:ascii="Calibri" w:hAnsi="Calibri"/>
+                <w:b/>
+                <w:color w:val="1F2937"/>
+                <w:sz w:val="20"/>
+              </w:rPr>
+              <w:t>Mô tả chi tiết luồng xử lý</w:t>
+            </w:r>
+          </w:p>
+        </w:tc>
+        <w:tc>
+          <w:tcPr>
+            <w:tcW w:type="dxa" w:w="1584"/>
+            <w:tcMar>
+              <w:top w:w="80" w:type="dxa"/>
+              <w:bottom w:w="80" w:type="dxa"/>
+              <w:left w:w="60" w:type="dxa"/>
+              <w:right w:w="60" w:type="dxa"/>
+            </w:tcMar>
+            <w:shd w:fill="F1F5F9"/>
+          </w:tcPr>
+          <w:p>
+            <w:pPr>
+              <w:spacing w:before="40" w:after="40" w:line="276" w:lineRule="auto"/>
+              <w:jc w:val="left"/>
+            </w:pPr>
+            <w:r/>
+            <w:r>
+              <w:rPr>
+                <w:rFonts w:ascii="Calibri" w:hAnsi="Calibri"/>
+                <w:b/>
+                <w:color w:val="1F2937"/>
+                <w:sz w:val="20"/>
+              </w:rPr>
+              <w:t>Dữ liệu &amp; Chứng từ</w:t>
+            </w:r>
+          </w:p>
+        </w:tc>
+      </w:tr>
+      <w:tr>
+        <w:tc>
+          <w:tcPr>
+            <w:tcW w:type="dxa" w:w="864"/>
+            <w:tcMar>
+              <w:top w:w="60" w:type="dxa"/>
+              <w:bottom w:w="60" w:type="dxa"/>
+              <w:left w:w="60" w:type="dxa"/>
+              <w:right w:w="60" w:type="dxa"/>
+            </w:tcMar>
+          </w:tcPr>
+          <w:p>
+            <w:pPr>
+              <w:spacing w:before="40" w:after="40" w:line="276" w:lineRule="auto"/>
+              <w:jc w:val="center"/>
+            </w:pPr>
+            <w:r/>
+            <w:r>
+              <w:rPr>
+                <w:rFonts w:ascii="Calibri" w:hAnsi="Calibri"/>
+                <w:sz w:val="19"/>
+              </w:rPr>
+              <w:t>01</w:t>
+            </w:r>
+          </w:p>
+        </w:tc>
+        <w:tc>
+          <w:tcPr>
+            <w:tcW w:type="dxa" w:w="1872"/>
+            <w:tcMar>
+              <w:top w:w="60" w:type="dxa"/>
+              <w:bottom w:w="60" w:type="dxa"/>
+              <w:left w:w="60" w:type="dxa"/>
+              <w:right w:w="60" w:type="dxa"/>
+            </w:tcMar>
+          </w:tcPr>
+          <w:p>
+            <w:pPr>
+              <w:spacing w:before="40" w:after="40" w:line="276" w:lineRule="auto"/>
+              <w:jc w:val="left"/>
+            </w:pPr>
+            <w:r/>
+            <w:r>
+              <w:rPr>
+                <w:rFonts w:ascii="Calibri" w:hAnsi="Calibri"/>
+                <w:b/>
+                <w:sz w:val="19"/>
+              </w:rPr>
+              <w:t>Vận hành FV</w:t>
+            </w:r>
+          </w:p>
+        </w:tc>
+        <w:tc>
+          <w:tcPr>
+            <w:tcW w:type="dxa" w:w="2304"/>
+            <w:tcMar>
+              <w:top w:w="60" w:type="dxa"/>
+              <w:bottom w:w="60" w:type="dxa"/>
+              <w:left w:w="60" w:type="dxa"/>
+              <w:right w:w="60" w:type="dxa"/>
+            </w:tcMar>
+          </w:tcPr>
+          <w:p>
+            <w:pPr>
+              <w:spacing w:before="40" w:after="40" w:line="276" w:lineRule="auto"/>
+              <w:jc w:val="left"/>
+            </w:pPr>
+            <w:r/>
+            <w:r>
+              <w:rPr>
+                <w:rFonts w:ascii="Calibri" w:hAnsi="Calibri"/>
+                <w:b/>
+                <w:sz w:val="19"/>
+              </w:rPr>
+              <w:t>Ký hợp đồng dịch vụ</w:t>
+            </w:r>
+          </w:p>
+        </w:tc>
+        <w:tc>
+          <w:tcPr>
+            <w:tcW w:type="dxa" w:w="3168"/>
+            <w:tcMar>
+              <w:top w:w="60" w:type="dxa"/>
+              <w:bottom w:w="60" w:type="dxa"/>
+              <w:left w:w="60" w:type="dxa"/>
+              <w:right w:w="60" w:type="dxa"/>
+            </w:tcMar>
+          </w:tcPr>
+          <w:p>
+            <w:pPr>
+              <w:spacing w:before="40" w:after="40" w:line="276" w:lineRule="auto"/>
+              <w:jc w:val="left"/>
+            </w:pPr>
+            <w:r/>
+            <w:r>
+              <w:rPr>
+                <w:rFonts w:ascii="Calibri" w:hAnsi="Calibri"/>
+                <w:sz w:val="19"/>
+              </w:rPr>
+              <w:t>Finviet và Nhà trường hoàn tất đàm phán, thống nhất điều khoản và ký hợp đồng cung cấp dịch vụ giải pháp thẻ ECO và các tiện ích số trường học.</w:t>
+            </w:r>
+          </w:p>
+        </w:tc>
+        <w:tc>
+          <w:tcPr>
+            <w:tcW w:type="dxa" w:w="1584"/>
+            <w:tcMar>
+              <w:top w:w="60" w:type="dxa"/>
+              <w:bottom w:w="60" w:type="dxa"/>
+              <w:left w:w="60" w:type="dxa"/>
+              <w:right w:w="60" w:type="dxa"/>
+            </w:tcMar>
+          </w:tcPr>
+          <w:p>
+            <w:pPr>
+              <w:spacing w:before="40" w:after="40" w:line="276" w:lineRule="auto"/>
+              <w:jc w:val="left"/>
+            </w:pPr>
+            <w:r/>
+            <w:r>
+              <w:rPr>
+                <w:rFonts w:ascii="Calibri" w:hAnsi="Calibri"/>
+                <w:sz w:val="19"/>
+              </w:rPr>
+              <w:t>Hợp đồng dịch vụ, Phụ lục biểu phí</w:t>
+            </w:r>
+          </w:p>
+        </w:tc>
+      </w:tr>
+      <w:tr>
+        <w:tc>
+          <w:tcPr>
+            <w:tcW w:type="dxa" w:w="864"/>
+            <w:tcMar>
+              <w:top w:w="60" w:type="dxa"/>
+              <w:bottom w:w="60" w:type="dxa"/>
+              <w:left w:w="60" w:type="dxa"/>
+              <w:right w:w="60" w:type="dxa"/>
+            </w:tcMar>
+          </w:tcPr>
+          <w:p>
+            <w:pPr>
+              <w:spacing w:before="40" w:after="40" w:line="276" w:lineRule="auto"/>
+              <w:jc w:val="center"/>
+            </w:pPr>
+            <w:r/>
+            <w:r>
+              <w:rPr>
+                <w:rFonts w:ascii="Calibri" w:hAnsi="Calibri"/>
+                <w:sz w:val="19"/>
+              </w:rPr>
+              <w:t>02</w:t>
+            </w:r>
+          </w:p>
+        </w:tc>
+        <w:tc>
+          <w:tcPr>
+            <w:tcW w:type="dxa" w:w="1872"/>
+            <w:tcMar>
+              <w:top w:w="60" w:type="dxa"/>
+              <w:bottom w:w="60" w:type="dxa"/>
+              <w:left w:w="60" w:type="dxa"/>
+              <w:right w:w="60" w:type="dxa"/>
+            </w:tcMar>
+          </w:tcPr>
+          <w:p>
+            <w:pPr>
+              <w:spacing w:before="40" w:after="40" w:line="276" w:lineRule="auto"/>
+              <w:jc w:val="left"/>
+            </w:pPr>
+            <w:r/>
+            <w:r>
+              <w:rPr>
+                <w:rFonts w:ascii="Calibri" w:hAnsi="Calibri"/>
+                <w:b/>
+                <w:sz w:val="19"/>
+              </w:rPr>
+              <w:t>Vận hành FV</w:t>
+            </w:r>
+          </w:p>
+        </w:tc>
+        <w:tc>
+          <w:tcPr>
+            <w:tcW w:type="dxa" w:w="2304"/>
+            <w:tcMar>
+              <w:top w:w="60" w:type="dxa"/>
+              <w:bottom w:w="60" w:type="dxa"/>
+              <w:left w:w="60" w:type="dxa"/>
+              <w:right w:w="60" w:type="dxa"/>
+            </w:tcMar>
+          </w:tcPr>
+          <w:p>
+            <w:pPr>
+              <w:spacing w:before="40" w:after="40" w:line="276" w:lineRule="auto"/>
+              <w:jc w:val="left"/>
+            </w:pPr>
+            <w:r/>
+            <w:r>
+              <w:rPr>
+                <w:rFonts w:ascii="Calibri" w:hAnsi="Calibri"/>
+                <w:b/>
+                <w:sz w:val="19"/>
+              </w:rPr>
+              <w:t>Tạo trường &amp; các chi nhánh của trường</w:t>
+            </w:r>
+          </w:p>
+        </w:tc>
+        <w:tc>
+          <w:tcPr>
+            <w:tcW w:type="dxa" w:w="3168"/>
+            <w:tcMar>
+              <w:top w:w="60" w:type="dxa"/>
+              <w:bottom w:w="60" w:type="dxa"/>
+              <w:left w:w="60" w:type="dxa"/>
+              <w:right w:w="60" w:type="dxa"/>
+            </w:tcMar>
+          </w:tcPr>
+          <w:p>
+            <w:pPr>
+              <w:spacing w:before="40" w:after="40" w:line="276" w:lineRule="auto"/>
+              <w:jc w:val="left"/>
+            </w:pPr>
+            <w:r/>
+            <w:r>
+              <w:rPr>
+                <w:rFonts w:ascii="Calibri" w:hAnsi="Calibri"/>
+                <w:sz w:val="19"/>
+              </w:rPr>
+              <w:t>Chuyên viên Vận hành khởi tạo hồ sơ pháp nhân nhóm trường (Mã nhóm duy nhất, bất biến) và các chi nhánh cơ sở trực thuộc trên hệ thống Cổng vận hành.</w:t>
+            </w:r>
+          </w:p>
+        </w:tc>
+        <w:tc>
+          <w:tcPr>
+            <w:tcW w:type="dxa" w:w="1584"/>
+            <w:tcMar>
+              <w:top w:w="60" w:type="dxa"/>
+              <w:bottom w:w="60" w:type="dxa"/>
+              <w:left w:w="60" w:type="dxa"/>
+              <w:right w:w="60" w:type="dxa"/>
+            </w:tcMar>
+          </w:tcPr>
+          <w:p>
+            <w:pPr>
+              <w:spacing w:before="40" w:after="40" w:line="276" w:lineRule="auto"/>
+              <w:jc w:val="left"/>
+            </w:pPr>
+            <w:r/>
+            <w:r>
+              <w:rPr>
+                <w:rFonts w:ascii="Calibri" w:hAnsi="Calibri"/>
+                <w:sz w:val="19"/>
+              </w:rPr>
+              <w:t>Tạo SchoolGroup &amp; SchoolBranch</w:t>
+            </w:r>
+          </w:p>
+        </w:tc>
+      </w:tr>
+      <w:tr>
+        <w:tc>
+          <w:tcPr>
+            <w:tcW w:type="dxa" w:w="864"/>
+            <w:tcMar>
+              <w:top w:w="60" w:type="dxa"/>
+              <w:bottom w:w="60" w:type="dxa"/>
+              <w:left w:w="60" w:type="dxa"/>
+              <w:right w:w="60" w:type="dxa"/>
+            </w:tcMar>
+          </w:tcPr>
+          <w:p>
+            <w:pPr>
+              <w:spacing w:before="40" w:after="40" w:line="276" w:lineRule="auto"/>
+              <w:jc w:val="center"/>
+            </w:pPr>
+            <w:r/>
+            <w:r>
+              <w:rPr>
+                <w:rFonts w:ascii="Calibri" w:hAnsi="Calibri"/>
+                <w:sz w:val="19"/>
+              </w:rPr>
+              <w:t>03</w:t>
+            </w:r>
+          </w:p>
+        </w:tc>
+        <w:tc>
+          <w:tcPr>
+            <w:tcW w:type="dxa" w:w="1872"/>
+            <w:tcMar>
+              <w:top w:w="60" w:type="dxa"/>
+              <w:bottom w:w="60" w:type="dxa"/>
+              <w:left w:w="60" w:type="dxa"/>
+              <w:right w:w="60" w:type="dxa"/>
+            </w:tcMar>
+          </w:tcPr>
+          <w:p>
+            <w:pPr>
+              <w:spacing w:before="40" w:after="40" w:line="276" w:lineRule="auto"/>
+              <w:jc w:val="left"/>
+            </w:pPr>
+            <w:r/>
+            <w:r>
+              <w:rPr>
+                <w:rFonts w:ascii="Calibri" w:hAnsi="Calibri"/>
+                <w:b/>
+                <w:sz w:val="19"/>
+              </w:rPr>
+              <w:t>Trường học</w:t>
+            </w:r>
+          </w:p>
+        </w:tc>
+        <w:tc>
+          <w:tcPr>
+            <w:tcW w:type="dxa" w:w="2304"/>
+            <w:tcMar>
+              <w:top w:w="60" w:type="dxa"/>
+              <w:bottom w:w="60" w:type="dxa"/>
+              <w:left w:w="60" w:type="dxa"/>
+              <w:right w:w="60" w:type="dxa"/>
+            </w:tcMar>
+          </w:tcPr>
+          <w:p>
+            <w:pPr>
+              <w:spacing w:before="40" w:after="40" w:line="276" w:lineRule="auto"/>
+              <w:jc w:val="left"/>
+            </w:pPr>
+            <w:r/>
+            <w:r>
+              <w:rPr>
+                <w:rFonts w:ascii="Calibri" w:hAnsi="Calibri"/>
+                <w:b/>
+                <w:sz w:val="19"/>
+              </w:rPr>
+              <w:t>Tạo master data trường học (HS, GV, Lớp...)</w:t>
+            </w:r>
+          </w:p>
+        </w:tc>
+        <w:tc>
+          <w:tcPr>
+            <w:tcW w:type="dxa" w:w="3168"/>
+            <w:tcMar>
+              <w:top w:w="60" w:type="dxa"/>
+              <w:bottom w:w="60" w:type="dxa"/>
+              <w:left w:w="60" w:type="dxa"/>
+              <w:right w:w="60" w:type="dxa"/>
+            </w:tcMar>
+          </w:tcPr>
+          <w:p>
+            <w:pPr>
+              <w:spacing w:before="40" w:after="40" w:line="276" w:lineRule="auto"/>
+              <w:jc w:val="left"/>
+            </w:pPr>
+            <w:r/>
+            <w:r>
+              <w:rPr>
+                <w:rFonts w:ascii="Calibri" w:hAnsi="Calibri"/>
+                <w:sz w:val="19"/>
+              </w:rPr>
+              <w:t>Ban giám hiệu hoặc Quản trị viên trường học thiết lập danh mục lớp học, hồ sơ học sinh, giáo viên và phân lớp giảng dạy trên hệ thống quản lý trường.</w:t>
+            </w:r>
+          </w:p>
+        </w:tc>
+        <w:tc>
+          <w:tcPr>
+            <w:tcW w:type="dxa" w:w="1584"/>
+            <w:tcMar>
+              <w:top w:w="60" w:type="dxa"/>
+              <w:bottom w:w="60" w:type="dxa"/>
+              <w:left w:w="60" w:type="dxa"/>
+              <w:right w:w="60" w:type="dxa"/>
+            </w:tcMar>
+          </w:tcPr>
+          <w:p>
+            <w:pPr>
+              <w:spacing w:before="40" w:after="40" w:line="276" w:lineRule="auto"/>
+              <w:jc w:val="left"/>
+            </w:pPr>
+            <w:r/>
+            <w:r>
+              <w:rPr>
+                <w:rFonts w:ascii="Calibri" w:hAnsi="Calibri"/>
+                <w:sz w:val="19"/>
+              </w:rPr>
+              <w:t>Master Data học sinh, giáo viên, lớp</w:t>
+            </w:r>
+          </w:p>
+        </w:tc>
+      </w:tr>
+      <w:tr>
+        <w:tc>
+          <w:tcPr>
+            <w:tcW w:type="dxa" w:w="864"/>
+            <w:tcMar>
+              <w:top w:w="60" w:type="dxa"/>
+              <w:bottom w:w="60" w:type="dxa"/>
+              <w:left w:w="60" w:type="dxa"/>
+              <w:right w:w="60" w:type="dxa"/>
+            </w:tcMar>
+          </w:tcPr>
+          <w:p>
+            <w:pPr>
+              <w:spacing w:before="40" w:after="40" w:line="276" w:lineRule="auto"/>
+              <w:jc w:val="center"/>
+            </w:pPr>
+            <w:r/>
+            <w:r>
+              <w:rPr>
+                <w:rFonts w:ascii="Calibri" w:hAnsi="Calibri"/>
+                <w:sz w:val="19"/>
+              </w:rPr>
+              <w:t>04</w:t>
+            </w:r>
+          </w:p>
+        </w:tc>
+        <w:tc>
+          <w:tcPr>
+            <w:tcW w:type="dxa" w:w="1872"/>
+            <w:tcMar>
+              <w:top w:w="60" w:type="dxa"/>
+              <w:bottom w:w="60" w:type="dxa"/>
+              <w:left w:w="60" w:type="dxa"/>
+              <w:right w:w="60" w:type="dxa"/>
+            </w:tcMar>
+          </w:tcPr>
+          <w:p>
+            <w:pPr>
+              <w:spacing w:before="40" w:after="40" w:line="276" w:lineRule="auto"/>
+              <w:jc w:val="left"/>
+            </w:pPr>
+            <w:r/>
+            <w:r>
+              <w:rPr>
+                <w:rFonts w:ascii="Calibri" w:hAnsi="Calibri"/>
+                <w:b/>
+                <w:sz w:val="19"/>
+              </w:rPr>
+              <w:t>ECO Card</w:t>
+            </w:r>
+          </w:p>
+        </w:tc>
+        <w:tc>
+          <w:tcPr>
+            <w:tcW w:type="dxa" w:w="2304"/>
+            <w:tcMar>
+              <w:top w:w="60" w:type="dxa"/>
+              <w:bottom w:w="60" w:type="dxa"/>
+              <w:left w:w="60" w:type="dxa"/>
+              <w:right w:w="60" w:type="dxa"/>
+            </w:tcMar>
+          </w:tcPr>
+          <w:p>
+            <w:pPr>
+              <w:spacing w:before="40" w:after="40" w:line="276" w:lineRule="auto"/>
+              <w:jc w:val="left"/>
+            </w:pPr>
+            <w:r/>
+            <w:r>
+              <w:rPr>
+                <w:rFonts w:ascii="Calibri" w:hAnsi="Calibri"/>
+                <w:b/>
+                <w:sz w:val="19"/>
+              </w:rPr>
+              <w:t>Đồng bộ trường học và Học sinh (Lớp, GV...)</w:t>
+            </w:r>
+          </w:p>
+        </w:tc>
+        <w:tc>
+          <w:tcPr>
+            <w:tcW w:type="dxa" w:w="3168"/>
+            <w:tcMar>
+              <w:top w:w="60" w:type="dxa"/>
+              <w:bottom w:w="60" w:type="dxa"/>
+              <w:left w:w="60" w:type="dxa"/>
+              <w:right w:w="60" w:type="dxa"/>
+            </w:tcMar>
+          </w:tcPr>
+          <w:p>
+            <w:pPr>
+              <w:spacing w:before="40" w:after="40" w:line="276" w:lineRule="auto"/>
+              <w:jc w:val="left"/>
+            </w:pPr>
+            <w:r/>
+            <w:r>
+              <w:rPr>
+                <w:rFonts w:ascii="Calibri" w:hAnsi="Calibri"/>
+                <w:sz w:val="19"/>
+              </w:rPr>
+              <w:t>Hệ thống ECO Card Portal tự động kết nối và đồng bộ hai chiều toàn bộ danh mục trường, lớp học, hồ sơ học sinh và giáo viên vào cơ sở dữ liệu đối soát.</w:t>
+            </w:r>
+          </w:p>
+        </w:tc>
+        <w:tc>
+          <w:tcPr>
+            <w:tcW w:type="dxa" w:w="1584"/>
+            <w:tcMar>
+              <w:top w:w="60" w:type="dxa"/>
+              <w:bottom w:w="60" w:type="dxa"/>
+              <w:left w:w="60" w:type="dxa"/>
+              <w:right w:w="60" w:type="dxa"/>
+            </w:tcMar>
+          </w:tcPr>
+          <w:p>
+            <w:pPr>
+              <w:spacing w:before="40" w:after="40" w:line="276" w:lineRule="auto"/>
+              <w:jc w:val="left"/>
+            </w:pPr>
+            <w:r/>
+            <w:r>
+              <w:rPr>
+                <w:rFonts w:ascii="Calibri" w:hAnsi="Calibri"/>
+                <w:sz w:val="19"/>
+              </w:rPr>
+              <w:t>Dữ liệu đồng bộ (Sync Database)</w:t>
+            </w:r>
+          </w:p>
+        </w:tc>
+      </w:tr>
+      <w:tr>
+        <w:tc>
+          <w:tcPr>
+            <w:tcW w:type="dxa" w:w="864"/>
+            <w:tcMar>
+              <w:top w:w="60" w:type="dxa"/>
+              <w:bottom w:w="60" w:type="dxa"/>
+              <w:left w:w="60" w:type="dxa"/>
+              <w:right w:w="60" w:type="dxa"/>
+            </w:tcMar>
+          </w:tcPr>
+          <w:p>
+            <w:pPr>
+              <w:spacing w:before="40" w:after="40" w:line="276" w:lineRule="auto"/>
+              <w:jc w:val="center"/>
+            </w:pPr>
+            <w:r/>
+            <w:r>
+              <w:rPr>
+                <w:rFonts w:ascii="Calibri" w:hAnsi="Calibri"/>
+                <w:sz w:val="19"/>
+              </w:rPr>
+              <w:t>05</w:t>
+            </w:r>
+          </w:p>
+        </w:tc>
+        <w:tc>
+          <w:tcPr>
+            <w:tcW w:type="dxa" w:w="1872"/>
+            <w:tcMar>
+              <w:top w:w="60" w:type="dxa"/>
+              <w:bottom w:w="60" w:type="dxa"/>
+              <w:left w:w="60" w:type="dxa"/>
+              <w:right w:w="60" w:type="dxa"/>
+            </w:tcMar>
+          </w:tcPr>
+          <w:p>
+            <w:pPr>
+              <w:spacing w:before="40" w:after="40" w:line="276" w:lineRule="auto"/>
+              <w:jc w:val="left"/>
+            </w:pPr>
+            <w:r/>
+            <w:r>
+              <w:rPr>
+                <w:rFonts w:ascii="Calibri" w:hAnsi="Calibri"/>
+                <w:b/>
+                <w:sz w:val="19"/>
+              </w:rPr>
+              <w:t>ECO Card</w:t>
+            </w:r>
+          </w:p>
+        </w:tc>
+        <w:tc>
+          <w:tcPr>
+            <w:tcW w:type="dxa" w:w="2304"/>
+            <w:tcMar>
+              <w:top w:w="60" w:type="dxa"/>
+              <w:bottom w:w="60" w:type="dxa"/>
+              <w:left w:w="60" w:type="dxa"/>
+              <w:right w:w="60" w:type="dxa"/>
+            </w:tcMar>
+          </w:tcPr>
+          <w:p>
+            <w:pPr>
+              <w:spacing w:before="40" w:after="40" w:line="276" w:lineRule="auto"/>
+              <w:jc w:val="left"/>
+            </w:pPr>
+            <w:r/>
+            <w:r>
+              <w:rPr>
+                <w:rFonts w:ascii="Calibri" w:hAnsi="Calibri"/>
+                <w:b/>
+                <w:sz w:val="19"/>
+              </w:rPr>
+              <w:t>Hiển thị danh sách &amp; trạng thái người dùng</w:t>
+            </w:r>
+          </w:p>
+        </w:tc>
+        <w:tc>
+          <w:tcPr>
+            <w:tcW w:type="dxa" w:w="3168"/>
+            <w:tcMar>
+              <w:top w:w="60" w:type="dxa"/>
+              <w:bottom w:w="60" w:type="dxa"/>
+              <w:left w:w="60" w:type="dxa"/>
+              <w:right w:w="60" w:type="dxa"/>
+            </w:tcMar>
+          </w:tcPr>
+          <w:p>
+            <w:pPr>
+              <w:spacing w:before="40" w:after="40" w:line="276" w:lineRule="auto"/>
+              <w:jc w:val="left"/>
+            </w:pPr>
+            <w:r/>
+            <w:r>
+              <w:rPr>
+                <w:rFonts w:ascii="Calibri" w:hAnsi="Calibri"/>
+                <w:sz w:val="19"/>
+              </w:rPr>
+              <w:t>Hệ thống hiển thị danh bạ người dùng, mã định danh thẻ UID, trạng thái tài khoản và thông tin lớp học phục vụ theo dõi vận hành.</w:t>
+            </w:r>
+          </w:p>
+        </w:tc>
+        <w:tc>
+          <w:tcPr>
+            <w:tcW w:type="dxa" w:w="1584"/>
+            <w:tcMar>
+              <w:top w:w="60" w:type="dxa"/>
+              <w:bottom w:w="60" w:type="dxa"/>
+              <w:left w:w="60" w:type="dxa"/>
+              <w:right w:w="60" w:type="dxa"/>
+            </w:tcMar>
+          </w:tcPr>
+          <w:p>
+            <w:pPr>
+              <w:spacing w:before="40" w:after="40" w:line="276" w:lineRule="auto"/>
+              <w:jc w:val="left"/>
+            </w:pPr>
+            <w:r/>
+            <w:r>
+              <w:rPr>
+                <w:rFonts w:ascii="Calibri" w:hAnsi="Calibri"/>
+                <w:sz w:val="19"/>
+              </w:rPr>
+              <w:t>Danh sách người dùng &amp; Thẻ học sinh</w:t>
+            </w:r>
+          </w:p>
+        </w:tc>
+      </w:tr>
+      <w:tr>
+        <w:tc>
+          <w:tcPr>
+            <w:tcW w:type="dxa" w:w="864"/>
+            <w:tcMar>
+              <w:top w:w="60" w:type="dxa"/>
+              <w:bottom w:w="60" w:type="dxa"/>
+              <w:left w:w="60" w:type="dxa"/>
+              <w:right w:w="60" w:type="dxa"/>
+            </w:tcMar>
+          </w:tcPr>
+          <w:p>
+            <w:pPr>
+              <w:spacing w:before="40" w:after="40" w:line="276" w:lineRule="auto"/>
+              <w:jc w:val="center"/>
+            </w:pPr>
+            <w:r/>
+            <w:r>
+              <w:rPr>
+                <w:rFonts w:ascii="Calibri" w:hAnsi="Calibri"/>
+                <w:sz w:val="19"/>
+              </w:rPr>
+              <w:t>06</w:t>
+            </w:r>
+          </w:p>
+        </w:tc>
+        <w:tc>
+          <w:tcPr>
+            <w:tcW w:type="dxa" w:w="1872"/>
+            <w:tcMar>
+              <w:top w:w="60" w:type="dxa"/>
+              <w:bottom w:w="60" w:type="dxa"/>
+              <w:left w:w="60" w:type="dxa"/>
+              <w:right w:w="60" w:type="dxa"/>
+            </w:tcMar>
+          </w:tcPr>
+          <w:p>
+            <w:pPr>
+              <w:spacing w:before="40" w:after="40" w:line="276" w:lineRule="auto"/>
+              <w:jc w:val="left"/>
+            </w:pPr>
+            <w:r/>
+            <w:r>
+              <w:rPr>
+                <w:rFonts w:ascii="Calibri" w:hAnsi="Calibri"/>
+                <w:b/>
+                <w:sz w:val="19"/>
+              </w:rPr>
+              <w:t>ECO Card</w:t>
+            </w:r>
+          </w:p>
+        </w:tc>
+        <w:tc>
+          <w:tcPr>
+            <w:tcW w:type="dxa" w:w="2304"/>
+            <w:tcMar>
+              <w:top w:w="60" w:type="dxa"/>
+              <w:bottom w:w="60" w:type="dxa"/>
+              <w:left w:w="60" w:type="dxa"/>
+              <w:right w:w="60" w:type="dxa"/>
+            </w:tcMar>
+          </w:tcPr>
+          <w:p>
+            <w:pPr>
+              <w:spacing w:before="40" w:after="40" w:line="276" w:lineRule="auto"/>
+              <w:jc w:val="left"/>
+            </w:pPr>
+            <w:r/>
+            <w:r>
+              <w:rPr>
+                <w:rFonts w:ascii="Calibri" w:hAnsi="Calibri"/>
+                <w:b/>
+                <w:sz w:val="19"/>
+              </w:rPr>
+              <w:t>Cấu hình dịch vụ trường học</w:t>
+            </w:r>
+          </w:p>
+        </w:tc>
+        <w:tc>
+          <w:tcPr>
+            <w:tcW w:type="dxa" w:w="3168"/>
+            <w:tcMar>
+              <w:top w:w="60" w:type="dxa"/>
+              <w:bottom w:w="60" w:type="dxa"/>
+              <w:left w:w="60" w:type="dxa"/>
+              <w:right w:w="60" w:type="dxa"/>
+            </w:tcMar>
+          </w:tcPr>
+          <w:p>
+            <w:pPr>
+              <w:spacing w:before="40" w:after="40" w:line="276" w:lineRule="auto"/>
+              <w:jc w:val="left"/>
+            </w:pPr>
+            <w:r/>
+            <w:r>
+              <w:rPr>
+                <w:rFonts w:ascii="Calibri" w:hAnsi="Calibri"/>
+                <w:sz w:val="19"/>
+              </w:rPr>
+              <w:t>Chuyên viên thiết lập danh mục dịch vụ số áp dụng cho từng chi nhánh: Phần mềm quản lý nhà trường, Camera AI, Thẻ học sinh, Căn tin học đường.</w:t>
+            </w:r>
+          </w:p>
+        </w:tc>
+        <w:tc>
+          <w:tcPr>
+            <w:tcW w:type="dxa" w:w="1584"/>
+            <w:tcMar>
+              <w:top w:w="60" w:type="dxa"/>
+              <w:bottom w:w="60" w:type="dxa"/>
+              <w:left w:w="60" w:type="dxa"/>
+              <w:right w:w="60" w:type="dxa"/>
+            </w:tcMar>
+          </w:tcPr>
+          <w:p>
+            <w:pPr>
+              <w:spacing w:before="40" w:after="40" w:line="276" w:lineRule="auto"/>
+              <w:jc w:val="left"/>
+            </w:pPr>
+            <w:r/>
+            <w:r>
+              <w:rPr>
+                <w:rFonts w:ascii="Calibri" w:hAnsi="Calibri"/>
+                <w:sz w:val="19"/>
+              </w:rPr>
+              <w:t>Danh mục dịch vụ kích hoạt</w:t>
+            </w:r>
+          </w:p>
+        </w:tc>
+      </w:tr>
+      <w:tr>
+        <w:tc>
+          <w:tcPr>
+            <w:tcW w:type="dxa" w:w="864"/>
+            <w:tcMar>
+              <w:top w:w="60" w:type="dxa"/>
+              <w:bottom w:w="60" w:type="dxa"/>
+              <w:left w:w="60" w:type="dxa"/>
+              <w:right w:w="60" w:type="dxa"/>
+            </w:tcMar>
+          </w:tcPr>
+          <w:p>
+            <w:pPr>
+              <w:spacing w:before="40" w:after="40" w:line="276" w:lineRule="auto"/>
+              <w:jc w:val="center"/>
+            </w:pPr>
+            <w:r/>
+            <w:r>
+              <w:rPr>
+                <w:rFonts w:ascii="Calibri" w:hAnsi="Calibri"/>
+                <w:sz w:val="19"/>
+              </w:rPr>
+              <w:t>07</w:t>
+            </w:r>
+          </w:p>
+        </w:tc>
+        <w:tc>
+          <w:tcPr>
+            <w:tcW w:type="dxa" w:w="1872"/>
+            <w:tcMar>
+              <w:top w:w="60" w:type="dxa"/>
+              <w:bottom w:w="60" w:type="dxa"/>
+              <w:left w:w="60" w:type="dxa"/>
+              <w:right w:w="60" w:type="dxa"/>
+            </w:tcMar>
+          </w:tcPr>
+          <w:p>
+            <w:pPr>
+              <w:spacing w:before="40" w:after="40" w:line="276" w:lineRule="auto"/>
+              <w:jc w:val="left"/>
+            </w:pPr>
+            <w:r/>
+            <w:r>
+              <w:rPr>
+                <w:rFonts w:ascii="Calibri" w:hAnsi="Calibri"/>
+                <w:b/>
+                <w:sz w:val="19"/>
+              </w:rPr>
+              <w:t>ECO Card</w:t>
+            </w:r>
+          </w:p>
+        </w:tc>
+        <w:tc>
+          <w:tcPr>
+            <w:tcW w:type="dxa" w:w="2304"/>
+            <w:tcMar>
+              <w:top w:w="60" w:type="dxa"/>
+              <w:bottom w:w="60" w:type="dxa"/>
+              <w:left w:w="60" w:type="dxa"/>
+              <w:right w:w="60" w:type="dxa"/>
+            </w:tcMar>
+          </w:tcPr>
+          <w:p>
+            <w:pPr>
+              <w:spacing w:before="40" w:after="40" w:line="276" w:lineRule="auto"/>
+              <w:jc w:val="left"/>
+            </w:pPr>
+            <w:r/>
+            <w:r>
+              <w:rPr>
+                <w:rFonts w:ascii="Calibri" w:hAnsi="Calibri"/>
+                <w:b/>
+                <w:sz w:val="19"/>
+              </w:rPr>
+              <w:t>Cấu hình biểu phí dịch vụ (SM1)</w:t>
+            </w:r>
+          </w:p>
+        </w:tc>
+        <w:tc>
+          <w:tcPr>
+            <w:tcW w:type="dxa" w:w="3168"/>
+            <w:tcMar>
+              <w:top w:w="60" w:type="dxa"/>
+              <w:bottom w:w="60" w:type="dxa"/>
+              <w:left w:w="60" w:type="dxa"/>
+              <w:right w:w="60" w:type="dxa"/>
+            </w:tcMar>
+          </w:tcPr>
+          <w:p>
+            <w:pPr>
+              <w:spacing w:before="40" w:after="40" w:line="276" w:lineRule="auto"/>
+              <w:jc w:val="left"/>
+            </w:pPr>
+            <w:r/>
+            <w:r>
+              <w:rPr>
+                <w:rFonts w:ascii="Calibri" w:hAnsi="Calibri"/>
+                <w:sz w:val="19"/>
+              </w:rPr>
+              <w:t>Thiết lập đơn vị đối soát (GROUP vs BRANCH), chu kỳ (Năm vs Kỳ), ma trận đơn giá (đ/HS/năm hoặc đ/HS/tháng), lịch kỳ và ngưỡng thu phí (BR01 – BR08).</w:t>
+            </w:r>
+          </w:p>
+        </w:tc>
+        <w:tc>
+          <w:tcPr>
+            <w:tcW w:type="dxa" w:w="1584"/>
+            <w:tcMar>
+              <w:top w:w="60" w:type="dxa"/>
+              <w:bottom w:w="60" w:type="dxa"/>
+              <w:left w:w="60" w:type="dxa"/>
+              <w:right w:w="60" w:type="dxa"/>
+            </w:tcMar>
+          </w:tcPr>
+          <w:p>
+            <w:pPr>
+              <w:spacing w:before="40" w:after="40" w:line="276" w:lineRule="auto"/>
+              <w:jc w:val="left"/>
+            </w:pPr>
+            <w:r/>
+            <w:r>
+              <w:rPr>
+                <w:rFonts w:ascii="Calibri" w:hAnsi="Calibri"/>
+                <w:sz w:val="19"/>
+              </w:rPr>
+              <w:t>Cấu hình biểu phí hoàn chỉnh (SM1)</w:t>
+            </w:r>
+          </w:p>
+        </w:tc>
+      </w:tr>
+      <w:tr>
+        <w:tc>
+          <w:tcPr>
+            <w:tcW w:type="dxa" w:w="864"/>
+            <w:tcMar>
+              <w:top w:w="60" w:type="dxa"/>
+              <w:bottom w:w="60" w:type="dxa"/>
+              <w:left w:w="60" w:type="dxa"/>
+              <w:right w:w="60" w:type="dxa"/>
+            </w:tcMar>
+          </w:tcPr>
+          <w:p>
+            <w:pPr>
+              <w:spacing w:before="40" w:after="40" w:line="276" w:lineRule="auto"/>
+              <w:jc w:val="center"/>
+            </w:pPr>
+            <w:r/>
+            <w:r>
+              <w:rPr>
+                <w:rFonts w:ascii="Calibri" w:hAnsi="Calibri"/>
+                <w:sz w:val="19"/>
+              </w:rPr>
+              <w:t>08</w:t>
+            </w:r>
+          </w:p>
+        </w:tc>
+        <w:tc>
+          <w:tcPr>
+            <w:tcW w:type="dxa" w:w="1872"/>
+            <w:tcMar>
+              <w:top w:w="60" w:type="dxa"/>
+              <w:bottom w:w="60" w:type="dxa"/>
+              <w:left w:w="60" w:type="dxa"/>
+              <w:right w:w="60" w:type="dxa"/>
+            </w:tcMar>
+          </w:tcPr>
+          <w:p>
+            <w:pPr>
+              <w:spacing w:before="40" w:after="40" w:line="276" w:lineRule="auto"/>
+              <w:jc w:val="left"/>
+            </w:pPr>
+            <w:r/>
+            <w:r>
+              <w:rPr>
+                <w:rFonts w:ascii="Calibri" w:hAnsi="Calibri"/>
+                <w:b/>
+                <w:sz w:val="19"/>
+              </w:rPr>
+              <w:t>Trường học</w:t>
+            </w:r>
+          </w:p>
+        </w:tc>
+        <w:tc>
+          <w:tcPr>
+            <w:tcW w:type="dxa" w:w="2304"/>
+            <w:tcMar>
+              <w:top w:w="60" w:type="dxa"/>
+              <w:bottom w:w="60" w:type="dxa"/>
+              <w:left w:w="60" w:type="dxa"/>
+              <w:right w:w="60" w:type="dxa"/>
+            </w:tcMar>
+          </w:tcPr>
+          <w:p>
+            <w:pPr>
+              <w:spacing w:before="40" w:after="40" w:line="276" w:lineRule="auto"/>
+              <w:jc w:val="left"/>
+            </w:pPr>
+            <w:r/>
+            <w:r>
+              <w:rPr>
+                <w:rFonts w:ascii="Calibri" w:hAnsi="Calibri"/>
+                <w:b/>
+                <w:sz w:val="19"/>
+              </w:rPr>
+              <w:t>Triển khai &amp; sử dụng dịch vụ</w:t>
+            </w:r>
+          </w:p>
+        </w:tc>
+        <w:tc>
+          <w:tcPr>
+            <w:tcW w:type="dxa" w:w="3168"/>
+            <w:tcMar>
+              <w:top w:w="60" w:type="dxa"/>
+              <w:bottom w:w="60" w:type="dxa"/>
+              <w:left w:w="60" w:type="dxa"/>
+              <w:right w:w="60" w:type="dxa"/>
+            </w:tcMar>
+          </w:tcPr>
+          <w:p>
+            <w:pPr>
+              <w:spacing w:before="40" w:after="40" w:line="276" w:lineRule="auto"/>
+              <w:jc w:val="left"/>
+            </w:pPr>
+            <w:r/>
+            <w:r>
+              <w:rPr>
+                <w:rFonts w:ascii="Calibri" w:hAnsi="Calibri"/>
+                <w:sz w:val="19"/>
+              </w:rPr>
+              <w:t>Nhà trường đưa dịch vụ vào vận hành thực tế. Học sinh quẹt thẻ điểm danh thông minh, ăn bán trú, vào thư viện và sử dụng tiện ích hàng ngày.</w:t>
+            </w:r>
+          </w:p>
+        </w:tc>
+        <w:tc>
+          <w:tcPr>
+            <w:tcW w:type="dxa" w:w="1584"/>
+            <w:tcMar>
+              <w:top w:w="60" w:type="dxa"/>
+              <w:bottom w:w="60" w:type="dxa"/>
+              <w:left w:w="60" w:type="dxa"/>
+              <w:right w:w="60" w:type="dxa"/>
+            </w:tcMar>
+          </w:tcPr>
+          <w:p>
+            <w:pPr>
+              <w:spacing w:before="40" w:after="40" w:line="276" w:lineRule="auto"/>
+              <w:jc w:val="left"/>
+            </w:pPr>
+            <w:r/>
+            <w:r>
+              <w:rPr>
+                <w:rFonts w:ascii="Calibri" w:hAnsi="Calibri"/>
+                <w:sz w:val="19"/>
+              </w:rPr>
+              <w:t>Nhật ký quẹt thẻ thực tế (Log)</w:t>
+            </w:r>
+          </w:p>
+        </w:tc>
+      </w:tr>
+      <w:tr>
+        <w:tc>
+          <w:tcPr>
+            <w:tcW w:type="dxa" w:w="864"/>
+            <w:tcMar>
+              <w:top w:w="60" w:type="dxa"/>
+              <w:bottom w:w="60" w:type="dxa"/>
+              <w:left w:w="60" w:type="dxa"/>
+              <w:right w:w="60" w:type="dxa"/>
+            </w:tcMar>
+          </w:tcPr>
+          <w:p>
+            <w:pPr>
+              <w:spacing w:before="40" w:after="40" w:line="276" w:lineRule="auto"/>
+              <w:jc w:val="center"/>
+            </w:pPr>
+            <w:r/>
+            <w:r>
+              <w:rPr>
+                <w:rFonts w:ascii="Calibri" w:hAnsi="Calibri"/>
+                <w:sz w:val="19"/>
+              </w:rPr>
+              <w:t>08+</w:t>
+            </w:r>
+          </w:p>
+        </w:tc>
+        <w:tc>
+          <w:tcPr>
+            <w:tcW w:type="dxa" w:w="1872"/>
+            <w:tcMar>
+              <w:top w:w="60" w:type="dxa"/>
+              <w:bottom w:w="60" w:type="dxa"/>
+              <w:left w:w="60" w:type="dxa"/>
+              <w:right w:w="60" w:type="dxa"/>
+            </w:tcMar>
+          </w:tcPr>
+          <w:p>
+            <w:pPr>
+              <w:spacing w:before="40" w:after="40" w:line="276" w:lineRule="auto"/>
+              <w:jc w:val="left"/>
+            </w:pPr>
+            <w:r/>
+            <w:r>
+              <w:rPr>
+                <w:rFonts w:ascii="Calibri" w:hAnsi="Calibri"/>
+                <w:b/>
+                <w:sz w:val="19"/>
+              </w:rPr>
+              <w:t>Trường học</w:t>
+            </w:r>
+          </w:p>
+        </w:tc>
+        <w:tc>
+          <w:tcPr>
+            <w:tcW w:type="dxa" w:w="2304"/>
+            <w:tcMar>
+              <w:top w:w="60" w:type="dxa"/>
+              <w:bottom w:w="60" w:type="dxa"/>
+              <w:left w:w="60" w:type="dxa"/>
+              <w:right w:w="60" w:type="dxa"/>
+            </w:tcMar>
+          </w:tcPr>
+          <w:p>
+            <w:pPr>
+              <w:spacing w:before="40" w:after="40" w:line="276" w:lineRule="auto"/>
+              <w:jc w:val="left"/>
+            </w:pPr>
+            <w:r/>
+            <w:r>
+              <w:rPr>
+                <w:rFonts w:ascii="Calibri" w:hAnsi="Calibri"/>
+                <w:b/>
+                <w:sz w:val="19"/>
+              </w:rPr>
+              <w:t>Cập nhật thông tin HS (Active / Inactive)</w:t>
+            </w:r>
+          </w:p>
+        </w:tc>
+        <w:tc>
+          <w:tcPr>
+            <w:tcW w:type="dxa" w:w="3168"/>
+            <w:tcMar>
+              <w:top w:w="60" w:type="dxa"/>
+              <w:bottom w:w="60" w:type="dxa"/>
+              <w:left w:w="60" w:type="dxa"/>
+              <w:right w:w="60" w:type="dxa"/>
+            </w:tcMar>
+          </w:tcPr>
+          <w:p>
+            <w:pPr>
+              <w:spacing w:before="40" w:after="40" w:line="276" w:lineRule="auto"/>
+              <w:jc w:val="left"/>
+            </w:pPr>
+            <w:r/>
+            <w:r>
+              <w:rPr>
+                <w:rFonts w:ascii="Calibri" w:hAnsi="Calibri"/>
+                <w:sz w:val="19"/>
+              </w:rPr>
+              <w:t>[Cổng phân nhánh song song +]: Trong quá trình sử dụng, nhà trường liên tục cập nhật trạng thái học sinh chuyển trường, nghỉ ốm, bảo lưu (Inactive) hoặc nhập học mới (Active). Mốc chốt số liệu được ghi nhận theo thời gian thực.</w:t>
+            </w:r>
+          </w:p>
+        </w:tc>
+        <w:tc>
+          <w:tcPr>
+            <w:tcW w:type="dxa" w:w="1584"/>
+            <w:tcMar>
+              <w:top w:w="60" w:type="dxa"/>
+              <w:bottom w:w="60" w:type="dxa"/>
+              <w:left w:w="60" w:type="dxa"/>
+              <w:right w:w="60" w:type="dxa"/>
+            </w:tcMar>
+          </w:tcPr>
+          <w:p>
+            <w:pPr>
+              <w:spacing w:before="40" w:after="40" w:line="276" w:lineRule="auto"/>
+              <w:jc w:val="left"/>
+            </w:pPr>
+            <w:r/>
+            <w:r>
+              <w:rPr>
+                <w:rFonts w:ascii="Calibri" w:hAnsi="Calibri"/>
+                <w:sz w:val="19"/>
+              </w:rPr>
+              <w:t>Biến động trạng thái Active / Inactive</w:t>
+            </w:r>
+          </w:p>
+        </w:tc>
+      </w:tr>
+      <w:tr>
+        <w:tc>
+          <w:tcPr>
+            <w:tcW w:type="dxa" w:w="864"/>
+            <w:tcMar>
+              <w:top w:w="60" w:type="dxa"/>
+              <w:bottom w:w="60" w:type="dxa"/>
+              <w:left w:w="60" w:type="dxa"/>
+              <w:right w:w="60" w:type="dxa"/>
+            </w:tcMar>
+          </w:tcPr>
+          <w:p>
+            <w:pPr>
+              <w:spacing w:before="40" w:after="40" w:line="276" w:lineRule="auto"/>
+              <w:jc w:val="center"/>
+            </w:pPr>
+            <w:r/>
+            <w:r>
+              <w:rPr>
+                <w:rFonts w:ascii="Calibri" w:hAnsi="Calibri"/>
+                <w:sz w:val="19"/>
+              </w:rPr>
+              <w:t>09</w:t>
+            </w:r>
+          </w:p>
+        </w:tc>
+        <w:tc>
+          <w:tcPr>
+            <w:tcW w:type="dxa" w:w="1872"/>
+            <w:tcMar>
+              <w:top w:w="60" w:type="dxa"/>
+              <w:bottom w:w="60" w:type="dxa"/>
+              <w:left w:w="60" w:type="dxa"/>
+              <w:right w:w="60" w:type="dxa"/>
+            </w:tcMar>
+          </w:tcPr>
+          <w:p>
+            <w:pPr>
+              <w:spacing w:before="40" w:after="40" w:line="276" w:lineRule="auto"/>
+              <w:jc w:val="left"/>
+            </w:pPr>
+            <w:r/>
+            <w:r>
+              <w:rPr>
+                <w:rFonts w:ascii="Calibri" w:hAnsi="Calibri"/>
+                <w:b/>
+                <w:sz w:val="19"/>
+              </w:rPr>
+              <w:t>ECO Card</w:t>
+            </w:r>
+          </w:p>
+        </w:tc>
+        <w:tc>
+          <w:tcPr>
+            <w:tcW w:type="dxa" w:w="2304"/>
+            <w:tcMar>
+              <w:top w:w="60" w:type="dxa"/>
+              <w:bottom w:w="60" w:type="dxa"/>
+              <w:left w:w="60" w:type="dxa"/>
+              <w:right w:w="60" w:type="dxa"/>
+            </w:tcMar>
+          </w:tcPr>
+          <w:p>
+            <w:pPr>
+              <w:spacing w:before="40" w:after="40" w:line="276" w:lineRule="auto"/>
+              <w:jc w:val="left"/>
+            </w:pPr>
+            <w:r/>
+            <w:r>
+              <w:rPr>
+                <w:rFonts w:ascii="Calibri" w:hAnsi="Calibri"/>
+                <w:b/>
+                <w:sz w:val="19"/>
+              </w:rPr>
+              <w:t>KT tạo phiên đối soát thu phí dịch vụ (SM2)</w:t>
+            </w:r>
+          </w:p>
+        </w:tc>
+        <w:tc>
+          <w:tcPr>
+            <w:tcW w:type="dxa" w:w="3168"/>
+            <w:tcMar>
+              <w:top w:w="60" w:type="dxa"/>
+              <w:bottom w:w="60" w:type="dxa"/>
+              <w:left w:w="60" w:type="dxa"/>
+              <w:right w:w="60" w:type="dxa"/>
+            </w:tcMar>
+          </w:tcPr>
+          <w:p>
+            <w:pPr>
+              <w:spacing w:before="40" w:after="40" w:line="276" w:lineRule="auto"/>
+              <w:jc w:val="left"/>
+            </w:pPr>
+            <w:r/>
+            <w:r>
+              <w:rPr>
+                <w:rFonts w:ascii="Calibri" w:hAnsi="Calibri"/>
+                <w:sz w:val="19"/>
+              </w:rPr>
+              <w:t>Định kỳ, Kế toán Finviet khởi tạo phiên đối soát bằng Wizard 3 bước: Chọn nhóm/chi nhánh, chọn kỳ, chốt ngày quét số liệu. Động cơ tính phí chuẩn 30 ngày/tháng, kiểm tra ngưỡng (BR06), làm tròn ngày dư (BR07). Bộ chốt an toàn khóa tạo phiên nếu tổng phí = 0đ (MSG-01 / BR10). Đóng băng Snapshot bất biến (ADR-M6-001).</w:t>
+            </w:r>
+          </w:p>
+        </w:tc>
+        <w:tc>
+          <w:tcPr>
+            <w:tcW w:type="dxa" w:w="1584"/>
+            <w:tcMar>
+              <w:top w:w="60" w:type="dxa"/>
+              <w:bottom w:w="60" w:type="dxa"/>
+              <w:left w:w="60" w:type="dxa"/>
+              <w:right w:w="60" w:type="dxa"/>
+            </w:tcMar>
+          </w:tcPr>
+          <w:p>
+            <w:pPr>
+              <w:spacing w:before="40" w:after="40" w:line="276" w:lineRule="auto"/>
+              <w:jc w:val="left"/>
+            </w:pPr>
+            <w:r/>
+            <w:r>
+              <w:rPr>
+                <w:rFonts w:ascii="Calibri" w:hAnsi="Calibri"/>
+                <w:sz w:val="19"/>
+              </w:rPr>
+              <w:t>Phiên đối soát (DRAFT) &amp; Snapshot JSON</w:t>
+            </w:r>
+          </w:p>
+        </w:tc>
+      </w:tr>
+      <w:tr>
+        <w:tc>
+          <w:tcPr>
+            <w:tcW w:type="dxa" w:w="864"/>
+            <w:tcMar>
+              <w:top w:w="60" w:type="dxa"/>
+              <w:bottom w:w="60" w:type="dxa"/>
+              <w:left w:w="60" w:type="dxa"/>
+              <w:right w:w="60" w:type="dxa"/>
+            </w:tcMar>
+          </w:tcPr>
+          <w:p>
+            <w:pPr>
+              <w:spacing w:before="40" w:after="40" w:line="276" w:lineRule="auto"/>
+              <w:jc w:val="center"/>
+            </w:pPr>
+            <w:r/>
+            <w:r>
+              <w:rPr>
+                <w:rFonts w:ascii="Calibri" w:hAnsi="Calibri"/>
+                <w:sz w:val="19"/>
+              </w:rPr>
+              <w:t>10</w:t>
+            </w:r>
+          </w:p>
+        </w:tc>
+        <w:tc>
+          <w:tcPr>
+            <w:tcW w:type="dxa" w:w="1872"/>
+            <w:tcMar>
+              <w:top w:w="60" w:type="dxa"/>
+              <w:bottom w:w="60" w:type="dxa"/>
+              <w:left w:w="60" w:type="dxa"/>
+              <w:right w:w="60" w:type="dxa"/>
+            </w:tcMar>
+          </w:tcPr>
+          <w:p>
+            <w:pPr>
+              <w:spacing w:before="40" w:after="40" w:line="276" w:lineRule="auto"/>
+              <w:jc w:val="left"/>
+            </w:pPr>
+            <w:r/>
+            <w:r>
+              <w:rPr>
+                <w:rFonts w:ascii="Calibri" w:hAnsi="Calibri"/>
+                <w:b/>
+                <w:sz w:val="19"/>
+              </w:rPr>
+              <w:t>ECO Card</w:t>
+            </w:r>
+          </w:p>
+        </w:tc>
+        <w:tc>
+          <w:tcPr>
+            <w:tcW w:type="dxa" w:w="2304"/>
+            <w:tcMar>
+              <w:top w:w="60" w:type="dxa"/>
+              <w:bottom w:w="60" w:type="dxa"/>
+              <w:left w:w="60" w:type="dxa"/>
+              <w:right w:w="60" w:type="dxa"/>
+            </w:tcMar>
+          </w:tcPr>
+          <w:p>
+            <w:pPr>
+              <w:spacing w:before="40" w:after="40" w:line="276" w:lineRule="auto"/>
+              <w:jc w:val="left"/>
+            </w:pPr>
+            <w:r/>
+            <w:r>
+              <w:rPr>
+                <w:rFonts w:ascii="Calibri" w:hAnsi="Calibri"/>
+                <w:b/>
+                <w:sz w:val="19"/>
+              </w:rPr>
+              <w:t>KT kiểm tra, điều chỉnh &amp; gửi mail biên bản đối soát</w:t>
+            </w:r>
+          </w:p>
+        </w:tc>
+        <w:tc>
+          <w:tcPr>
+            <w:tcW w:type="dxa" w:w="3168"/>
+            <w:tcMar>
+              <w:top w:w="60" w:type="dxa"/>
+              <w:bottom w:w="60" w:type="dxa"/>
+              <w:left w:w="60" w:type="dxa"/>
+              <w:right w:w="60" w:type="dxa"/>
+            </w:tcMar>
+          </w:tcPr>
+          <w:p>
+            <w:pPr>
+              <w:spacing w:before="40" w:after="40" w:line="276" w:lineRule="auto"/>
+              <w:jc w:val="left"/>
+            </w:pPr>
+            <w:r/>
+            <w:r>
+              <w:rPr>
+                <w:rFonts w:ascii="Calibri" w:hAnsi="Calibri"/>
+                <w:sz w:val="19"/>
+              </w:rPr>
+              <w:t>Kế toán kiểm tra số liệu, kiểm toán đối chiếu Log song song (Side-by-Side Audit), gửi duyệt cấp quản lý. Sau khi duyệt, hệ thống phát hành email biên bản đối soát kèm mật khẩu file bảo mật đến trường.</w:t>
+            </w:r>
+          </w:p>
+        </w:tc>
+        <w:tc>
+          <w:tcPr>
+            <w:tcW w:type="dxa" w:w="1584"/>
+            <w:tcMar>
+              <w:top w:w="60" w:type="dxa"/>
+              <w:bottom w:w="60" w:type="dxa"/>
+              <w:left w:w="60" w:type="dxa"/>
+              <w:right w:w="60" w:type="dxa"/>
+            </w:tcMar>
+          </w:tcPr>
+          <w:p>
+            <w:pPr>
+              <w:spacing w:before="40" w:after="40" w:line="276" w:lineRule="auto"/>
+              <w:jc w:val="left"/>
+            </w:pPr>
+            <w:r/>
+            <w:r>
+              <w:rPr>
+                <w:rFonts w:ascii="Calibri" w:hAnsi="Calibri"/>
+                <w:sz w:val="19"/>
+              </w:rPr>
+              <w:t>Biên bản đối soát &amp; Mật khẩu file</w:t>
+            </w:r>
+          </w:p>
+        </w:tc>
+      </w:tr>
+      <w:tr>
+        <w:tc>
+          <w:tcPr>
+            <w:tcW w:type="dxa" w:w="864"/>
+            <w:tcMar>
+              <w:top w:w="60" w:type="dxa"/>
+              <w:bottom w:w="60" w:type="dxa"/>
+              <w:left w:w="60" w:type="dxa"/>
+              <w:right w:w="60" w:type="dxa"/>
+            </w:tcMar>
+          </w:tcPr>
+          <w:p>
+            <w:pPr>
+              <w:spacing w:before="40" w:after="40" w:line="276" w:lineRule="auto"/>
+              <w:jc w:val="center"/>
+            </w:pPr>
+            <w:r/>
+            <w:r>
+              <w:rPr>
+                <w:rFonts w:ascii="Calibri" w:hAnsi="Calibri"/>
+                <w:sz w:val="19"/>
+              </w:rPr>
+              <w:t>11</w:t>
+            </w:r>
+          </w:p>
+        </w:tc>
+        <w:tc>
+          <w:tcPr>
+            <w:tcW w:type="dxa" w:w="1872"/>
+            <w:tcMar>
+              <w:top w:w="60" w:type="dxa"/>
+              <w:bottom w:w="60" w:type="dxa"/>
+              <w:left w:w="60" w:type="dxa"/>
+              <w:right w:w="60" w:type="dxa"/>
+            </w:tcMar>
+          </w:tcPr>
+          <w:p>
+            <w:pPr>
+              <w:spacing w:before="40" w:after="40" w:line="276" w:lineRule="auto"/>
+              <w:jc w:val="left"/>
+            </w:pPr>
+            <w:r/>
+            <w:r>
+              <w:rPr>
+                <w:rFonts w:ascii="Calibri" w:hAnsi="Calibri"/>
+                <w:b/>
+                <w:sz w:val="19"/>
+              </w:rPr>
+              <w:t>Trường học</w:t>
+            </w:r>
+          </w:p>
+        </w:tc>
+        <w:tc>
+          <w:tcPr>
+            <w:tcW w:type="dxa" w:w="2304"/>
+            <w:tcMar>
+              <w:top w:w="60" w:type="dxa"/>
+              <w:bottom w:w="60" w:type="dxa"/>
+              <w:left w:w="60" w:type="dxa"/>
+              <w:right w:w="60" w:type="dxa"/>
+            </w:tcMar>
+          </w:tcPr>
+          <w:p>
+            <w:pPr>
+              <w:spacing w:before="40" w:after="40" w:line="276" w:lineRule="auto"/>
+              <w:jc w:val="left"/>
+            </w:pPr>
+            <w:r/>
+            <w:r>
+              <w:rPr>
+                <w:rFonts w:ascii="Calibri" w:hAnsi="Calibri"/>
+                <w:b/>
+                <w:sz w:val="19"/>
+              </w:rPr>
+              <w:t>Trường đối chiếu &amp; thanh toán phí dịch vụ cho FV</w:t>
+            </w:r>
+          </w:p>
+        </w:tc>
+        <w:tc>
+          <w:tcPr>
+            <w:tcW w:type="dxa" w:w="3168"/>
+            <w:tcMar>
+              <w:top w:w="60" w:type="dxa"/>
+              <w:bottom w:w="60" w:type="dxa"/>
+              <w:left w:w="60" w:type="dxa"/>
+              <w:right w:w="60" w:type="dxa"/>
+            </w:tcMar>
+          </w:tcPr>
+          <w:p>
+            <w:pPr>
+              <w:spacing w:before="40" w:after="40" w:line="276" w:lineRule="auto"/>
+              <w:jc w:val="left"/>
+            </w:pPr>
+            <w:r/>
+            <w:r>
+              <w:rPr>
+                <w:rFonts w:ascii="Calibri" w:hAnsi="Calibri"/>
+                <w:sz w:val="19"/>
+              </w:rPr>
+              <w:t>Kế toán nhà trường mở file đối soát bằng mật khẩu, đối chiếu số ngày hoạt động thực tế của từng học sinh và thực hiện chuyển khoản thanh toán phí dịch vụ cho Finviet.</w:t>
+            </w:r>
+          </w:p>
+        </w:tc>
+        <w:tc>
+          <w:tcPr>
+            <w:tcW w:type="dxa" w:w="1584"/>
+            <w:tcMar>
+              <w:top w:w="60" w:type="dxa"/>
+              <w:bottom w:w="60" w:type="dxa"/>
+              <w:left w:w="60" w:type="dxa"/>
+              <w:right w:w="60" w:type="dxa"/>
+            </w:tcMar>
+          </w:tcPr>
+          <w:p>
+            <w:pPr>
+              <w:spacing w:before="40" w:after="40" w:line="276" w:lineRule="auto"/>
+              <w:jc w:val="left"/>
+            </w:pPr>
+            <w:r/>
+            <w:r>
+              <w:rPr>
+                <w:rFonts w:ascii="Calibri" w:hAnsi="Calibri"/>
+                <w:sz w:val="19"/>
+              </w:rPr>
+              <w:t>Biên bản ký duyệt &amp; Ủy nhiệm chi (UNC)</w:t>
+            </w:r>
+          </w:p>
+        </w:tc>
+      </w:tr>
+      <w:tr>
+        <w:tc>
+          <w:tcPr>
+            <w:tcW w:type="dxa" w:w="864"/>
+            <w:tcMar>
+              <w:top w:w="60" w:type="dxa"/>
+              <w:bottom w:w="60" w:type="dxa"/>
+              <w:left w:w="60" w:type="dxa"/>
+              <w:right w:w="60" w:type="dxa"/>
+            </w:tcMar>
+          </w:tcPr>
+          <w:p>
+            <w:pPr>
+              <w:spacing w:before="40" w:after="40" w:line="276" w:lineRule="auto"/>
+              <w:jc w:val="center"/>
+            </w:pPr>
+            <w:r/>
+            <w:r>
+              <w:rPr>
+                <w:rFonts w:ascii="Calibri" w:hAnsi="Calibri"/>
+                <w:sz w:val="19"/>
+              </w:rPr>
+              <w:t>12</w:t>
+            </w:r>
+          </w:p>
+        </w:tc>
+        <w:tc>
+          <w:tcPr>
+            <w:tcW w:type="dxa" w:w="1872"/>
+            <w:tcMar>
+              <w:top w:w="60" w:type="dxa"/>
+              <w:bottom w:w="60" w:type="dxa"/>
+              <w:left w:w="60" w:type="dxa"/>
+              <w:right w:w="60" w:type="dxa"/>
+            </w:tcMar>
+          </w:tcPr>
+          <w:p>
+            <w:pPr>
+              <w:spacing w:before="40" w:after="40" w:line="276" w:lineRule="auto"/>
+              <w:jc w:val="left"/>
+            </w:pPr>
+            <w:r/>
+            <w:r>
+              <w:rPr>
+                <w:rFonts w:ascii="Calibri" w:hAnsi="Calibri"/>
+                <w:b/>
+                <w:sz w:val="19"/>
+              </w:rPr>
+              <w:t>ECO Card</w:t>
+            </w:r>
+          </w:p>
+        </w:tc>
+        <w:tc>
+          <w:tcPr>
+            <w:tcW w:type="dxa" w:w="2304"/>
+            <w:tcMar>
+              <w:top w:w="60" w:type="dxa"/>
+              <w:bottom w:w="60" w:type="dxa"/>
+              <w:left w:w="60" w:type="dxa"/>
+              <w:right w:w="60" w:type="dxa"/>
+            </w:tcMar>
+          </w:tcPr>
+          <w:p>
+            <w:pPr>
+              <w:spacing w:before="40" w:after="40" w:line="276" w:lineRule="auto"/>
+              <w:jc w:val="left"/>
+            </w:pPr>
+            <w:r/>
+            <w:r>
+              <w:rPr>
+                <w:rFonts w:ascii="Calibri" w:hAnsi="Calibri"/>
+                <w:b/>
+                <w:sz w:val="19"/>
+              </w:rPr>
+              <w:t>FV ghi nhận &amp; cập nhật phiên ĐÃ HOÀN TẤT đối soát</w:t>
+            </w:r>
+          </w:p>
+        </w:tc>
+        <w:tc>
+          <w:tcPr>
+            <w:tcW w:type="dxa" w:w="3168"/>
+            <w:tcMar>
+              <w:top w:w="60" w:type="dxa"/>
+              <w:bottom w:w="60" w:type="dxa"/>
+              <w:left w:w="60" w:type="dxa"/>
+              <w:right w:w="60" w:type="dxa"/>
+            </w:tcMar>
+          </w:tcPr>
+          <w:p>
+            <w:pPr>
+              <w:spacing w:before="40" w:after="40" w:line="276" w:lineRule="auto"/>
+              <w:jc w:val="left"/>
+            </w:pPr>
+            <w:r/>
+            <w:r>
+              <w:rPr>
+                <w:rFonts w:ascii="Calibri" w:hAnsi="Calibri"/>
+                <w:sz w:val="19"/>
+              </w:rPr>
+              <w:t>Kế toán Finviet kiểm tra sao kê ngân hàng, xác nhận tiền về và cập nhật trạng thái phiên đối soát sang ĐÃ THANH TOÁN (PAID). Mở quyền tạo phiên truy thu con nếu phát sinh học sinh mới.</w:t>
+            </w:r>
+          </w:p>
+        </w:tc>
+        <w:tc>
+          <w:tcPr>
+            <w:tcW w:type="dxa" w:w="1584"/>
+            <w:tcMar>
+              <w:top w:w="60" w:type="dxa"/>
+              <w:bottom w:w="60" w:type="dxa"/>
+              <w:left w:w="60" w:type="dxa"/>
+              <w:right w:w="60" w:type="dxa"/>
+            </w:tcMar>
+          </w:tcPr>
+          <w:p>
+            <w:pPr>
+              <w:spacing w:before="40" w:after="40" w:line="276" w:lineRule="auto"/>
+              <w:jc w:val="left"/>
+            </w:pPr>
+            <w:r/>
+            <w:r>
+              <w:rPr>
+                <w:rFonts w:ascii="Calibri" w:hAnsi="Calibri"/>
+                <w:sz w:val="19"/>
+              </w:rPr>
+              <w:t>Cập nhật trạng thái PAID</w:t>
+            </w:r>
+          </w:p>
+        </w:tc>
+      </w:tr>
+      <w:tr>
+        <w:tc>
+          <w:tcPr>
+            <w:tcW w:type="dxa" w:w="864"/>
+            <w:tcMar>
+              <w:top w:w="60" w:type="dxa"/>
+              <w:bottom w:w="60" w:type="dxa"/>
+              <w:left w:w="60" w:type="dxa"/>
+              <w:right w:w="60" w:type="dxa"/>
+            </w:tcMar>
+          </w:tcPr>
+          <w:p>
+            <w:pPr>
+              <w:spacing w:before="40" w:after="40" w:line="276" w:lineRule="auto"/>
+              <w:jc w:val="center"/>
+            </w:pPr>
+            <w:r/>
+            <w:r>
+              <w:rPr>
+                <w:rFonts w:ascii="Calibri" w:hAnsi="Calibri"/>
+                <w:sz w:val="19"/>
+              </w:rPr>
+              <w:t>13</w:t>
+            </w:r>
+          </w:p>
+        </w:tc>
+        <w:tc>
+          <w:tcPr>
+            <w:tcW w:type="dxa" w:w="1872"/>
+            <w:tcMar>
+              <w:top w:w="60" w:type="dxa"/>
+              <w:bottom w:w="60" w:type="dxa"/>
+              <w:left w:w="60" w:type="dxa"/>
+              <w:right w:w="60" w:type="dxa"/>
+            </w:tcMar>
+          </w:tcPr>
+          <w:p>
+            <w:pPr>
+              <w:spacing w:before="40" w:after="40" w:line="276" w:lineRule="auto"/>
+              <w:jc w:val="left"/>
+            </w:pPr>
+            <w:r/>
+            <w:r>
+              <w:rPr>
+                <w:rFonts w:ascii="Calibri" w:hAnsi="Calibri"/>
+                <w:b/>
+                <w:sz w:val="19"/>
+              </w:rPr>
+              <w:t>ECO Card</w:t>
+            </w:r>
+          </w:p>
+        </w:tc>
+        <w:tc>
+          <w:tcPr>
+            <w:tcW w:type="dxa" w:w="2304"/>
+            <w:tcMar>
+              <w:top w:w="60" w:type="dxa"/>
+              <w:bottom w:w="60" w:type="dxa"/>
+              <w:left w:w="60" w:type="dxa"/>
+              <w:right w:w="60" w:type="dxa"/>
+            </w:tcMar>
+          </w:tcPr>
+          <w:p>
+            <w:pPr>
+              <w:spacing w:before="40" w:after="40" w:line="276" w:lineRule="auto"/>
+              <w:jc w:val="left"/>
+            </w:pPr>
+            <w:r/>
+            <w:r>
+              <w:rPr>
+                <w:rFonts w:ascii="Calibri" w:hAnsi="Calibri"/>
+                <w:b/>
+                <w:sz w:val="19"/>
+              </w:rPr>
+              <w:t>Hoàn tất phiên đối soát</w:t>
+            </w:r>
+          </w:p>
+        </w:tc>
+        <w:tc>
+          <w:tcPr>
+            <w:tcW w:type="dxa" w:w="3168"/>
+            <w:tcMar>
+              <w:top w:w="60" w:type="dxa"/>
+              <w:bottom w:w="60" w:type="dxa"/>
+              <w:left w:w="60" w:type="dxa"/>
+              <w:right w:w="60" w:type="dxa"/>
+            </w:tcMar>
+          </w:tcPr>
+          <w:p>
+            <w:pPr>
+              <w:spacing w:before="40" w:after="40" w:line="276" w:lineRule="auto"/>
+              <w:jc w:val="left"/>
+            </w:pPr>
+            <w:r/>
+            <w:r>
+              <w:rPr>
+                <w:rFonts w:ascii="Calibri" w:hAnsi="Calibri"/>
+                <w:sz w:val="19"/>
+              </w:rPr>
+              <w:t>Phiên đối soát chính thức khép lại vòng đời (End Event), toàn bộ chứng từ được lưu trữ an toàn phục vụ thanh tra tài chính, hoàn tất chu kỳ đối soát.</w:t>
+            </w:r>
+          </w:p>
+        </w:tc>
+        <w:tc>
+          <w:tcPr>
+            <w:tcW w:type="dxa" w:w="1584"/>
+            <w:tcMar>
+              <w:top w:w="60" w:type="dxa"/>
+              <w:bottom w:w="60" w:type="dxa"/>
+              <w:left w:w="60" w:type="dxa"/>
+              <w:right w:w="60" w:type="dxa"/>
+            </w:tcMar>
+          </w:tcPr>
+          <w:p>
+            <w:pPr>
+              <w:spacing w:before="40" w:after="40" w:line="276" w:lineRule="auto"/>
+              <w:jc w:val="left"/>
+            </w:pPr>
+            <w:r/>
+            <w:r>
+              <w:rPr>
+                <w:rFonts w:ascii="Calibri" w:hAnsi="Calibri"/>
+                <w:sz w:val="19"/>
+              </w:rPr>
+              <w:t>Hồ sơ quyết toán lưu trữ hoàn tất</w:t>
+            </w:r>
+          </w:p>
+        </w:tc>
+      </w:tr>
+    </w:tbl>
     <w:p>
       <w:pPr>
         <w:spacing w:before="280" w:after="80"/>
@@ -8881,7 +10908,7 @@
               <w:drawing>
                 <wp:inline xmlns:a="http://schemas.openxmlformats.org/drawingml/2006/main" xmlns:pic="http://schemas.openxmlformats.org/drawingml/2006/picture">
                   <wp:extent cx="1828800" cy="913057"/>
-                  <wp:docPr id="1" name="Picture 1"/>
+                  <wp:docPr id="2" name="Picture 2"/>
                   <wp:cNvGraphicFramePr>
                     <a:graphicFrameLocks noChangeAspect="1"/>
                   </wp:cNvGraphicFramePr>
@@ -8893,7 +10920,7 @@
                           <pic:cNvPicPr/>
                         </pic:nvPicPr>
                         <pic:blipFill>
-                          <a:blip r:embed="rId9"/>
+                          <a:blip r:embed="rId10"/>
                           <a:stretch>
                             <a:fillRect/>
                           </a:stretch>
@@ -9670,7 +11697,7 @@
               <w:drawing>
                 <wp:inline xmlns:a="http://schemas.openxmlformats.org/drawingml/2006/main" xmlns:pic="http://schemas.openxmlformats.org/drawingml/2006/picture">
                   <wp:extent cx="1828800" cy="913057"/>
-                  <wp:docPr id="2" name="Picture 2"/>
+                  <wp:docPr id="3" name="Picture 3"/>
                   <wp:cNvGraphicFramePr>
                     <a:graphicFrameLocks noChangeAspect="1"/>
                   </wp:cNvGraphicFramePr>
@@ -9682,7 +11709,7 @@
                           <pic:cNvPicPr/>
                         </pic:nvPicPr>
                         <pic:blipFill>
-                          <a:blip r:embed="rId10"/>
+                          <a:blip r:embed="rId11"/>
                           <a:stretch>
                             <a:fillRect/>
                           </a:stretch>
@@ -10679,7 +12706,7 @@
               <w:drawing>
                 <wp:inline xmlns:a="http://schemas.openxmlformats.org/drawingml/2006/main" xmlns:pic="http://schemas.openxmlformats.org/drawingml/2006/picture">
                   <wp:extent cx="1828800" cy="913057"/>
-                  <wp:docPr id="3" name="Picture 3"/>
+                  <wp:docPr id="4" name="Picture 4"/>
                   <wp:cNvGraphicFramePr>
                     <a:graphicFrameLocks noChangeAspect="1"/>
                   </wp:cNvGraphicFramePr>
@@ -10691,7 +12718,7 @@
                           <pic:cNvPicPr/>
                         </pic:nvPicPr>
                         <pic:blipFill>
-                          <a:blip r:embed="rId11"/>
+                          <a:blip r:embed="rId12"/>
                           <a:stretch>
                             <a:fillRect/>
                           </a:stretch>
@@ -11578,7 +13605,7 @@
               <w:drawing>
                 <wp:inline xmlns:a="http://schemas.openxmlformats.org/drawingml/2006/main" xmlns:pic="http://schemas.openxmlformats.org/drawingml/2006/picture">
                   <wp:extent cx="1828800" cy="991195"/>
-                  <wp:docPr id="4" name="Picture 4"/>
+                  <wp:docPr id="5" name="Picture 5"/>
                   <wp:cNvGraphicFramePr>
                     <a:graphicFrameLocks noChangeAspect="1"/>
                   </wp:cNvGraphicFramePr>
@@ -11590,7 +13617,7 @@
                           <pic:cNvPicPr/>
                         </pic:nvPicPr>
                         <pic:blipFill>
-                          <a:blip r:embed="rId12"/>
+                          <a:blip r:embed="rId13"/>
                           <a:stretch>
                             <a:fillRect/>
                           </a:stretch>
@@ -12367,7 +14394,7 @@
               <w:drawing>
                 <wp:inline xmlns:a="http://schemas.openxmlformats.org/drawingml/2006/main" xmlns:pic="http://schemas.openxmlformats.org/drawingml/2006/picture">
                   <wp:extent cx="1828800" cy="913057"/>
-                  <wp:docPr id="5" name="Picture 5"/>
+                  <wp:docPr id="6" name="Picture 6"/>
                   <wp:cNvGraphicFramePr>
                     <a:graphicFrameLocks noChangeAspect="1"/>
                   </wp:cNvGraphicFramePr>
@@ -12379,7 +14406,7 @@
                           <pic:cNvPicPr/>
                         </pic:nvPicPr>
                         <pic:blipFill>
-                          <a:blip r:embed="rId13"/>
+                          <a:blip r:embed="rId14"/>
                           <a:stretch>
                             <a:fillRect/>
                           </a:stretch>
@@ -13156,7 +15183,7 @@
               <w:drawing>
                 <wp:inline xmlns:a="http://schemas.openxmlformats.org/drawingml/2006/main" xmlns:pic="http://schemas.openxmlformats.org/drawingml/2006/picture">
                   <wp:extent cx="1828800" cy="913057"/>
-                  <wp:docPr id="6" name="Picture 6"/>
+                  <wp:docPr id="7" name="Picture 7"/>
                   <wp:cNvGraphicFramePr>
                     <a:graphicFrameLocks noChangeAspect="1"/>
                   </wp:cNvGraphicFramePr>
@@ -13168,7 +15195,7 @@
                           <pic:cNvPicPr/>
                         </pic:nvPicPr>
                         <pic:blipFill>
-                          <a:blip r:embed="rId14"/>
+                          <a:blip r:embed="rId15"/>
                           <a:stretch>
                             <a:fillRect/>
                           </a:stretch>
@@ -13835,7 +15862,7 @@
               <w:drawing>
                 <wp:inline xmlns:a="http://schemas.openxmlformats.org/drawingml/2006/main" xmlns:pic="http://schemas.openxmlformats.org/drawingml/2006/picture">
                   <wp:extent cx="1828800" cy="913057"/>
-                  <wp:docPr id="7" name="Picture 7"/>
+                  <wp:docPr id="8" name="Picture 8"/>
                   <wp:cNvGraphicFramePr>
                     <a:graphicFrameLocks noChangeAspect="1"/>
                   </wp:cNvGraphicFramePr>
@@ -13847,7 +15874,7 @@
                           <pic:cNvPicPr/>
                         </pic:nvPicPr>
                         <pic:blipFill>
-                          <a:blip r:embed="rId15"/>
+                          <a:blip r:embed="rId16"/>
                           <a:stretch>
                             <a:fillRect/>
                           </a:stretch>
@@ -14514,7 +16541,7 @@
               <w:drawing>
                 <wp:inline xmlns:a="http://schemas.openxmlformats.org/drawingml/2006/main" xmlns:pic="http://schemas.openxmlformats.org/drawingml/2006/picture">
                   <wp:extent cx="1828800" cy="994767"/>
-                  <wp:docPr id="8" name="Picture 8"/>
+                  <wp:docPr id="9" name="Picture 9"/>
                   <wp:cNvGraphicFramePr>
                     <a:graphicFrameLocks noChangeAspect="1"/>
                   </wp:cNvGraphicFramePr>
@@ -14526,7 +16553,7 @@
                           <pic:cNvPicPr/>
                         </pic:nvPicPr>
                         <pic:blipFill>
-                          <a:blip r:embed="rId16"/>
+                          <a:blip r:embed="rId17"/>
                           <a:stretch>
                             <a:fillRect/>
                           </a:stretch>

</xml_diff>